<commit_message>
Programme Management: Replace RMD-001 Programme Roadmap with controlled production version
</commit_message>
<xml_diff>
--- a/tooling/ProgrammeManagement/01 Roadmap/RMD-001 Programme Roadmap.docx
+++ b/tooling/ProgrammeManagement/01 Roadmap/RMD-001 Programme Roadmap.docx
@@ -4,27 +4,44 @@
   <w:body>
     <w:p>
       <w:pPr>
-        <w:pStyle w:val="Heading1"/>
+        <w:jc w:val="center"/>
       </w:pPr>
       <w:r>
-        <w:t>JUSTDEFENDERS® PROGRAMME MANAGEMENT SYSTEM</w:t>
+        <w:rPr>
+          <w:b/>
+          <w:sz w:val="48"/>
+        </w:rPr>
+        <w:t>RMD-001</w:t>
+        <w:br/>
+        <w:t>Programme Roadmap</w:t>
+      </w:r>
+    </w:p>
+    <w:p>
+      <w:r>
+        <w:t>Repository: tooling\ProgrammeManagement\01 Roadmap\</w:t>
+      </w:r>
+    </w:p>
+    <w:p>
+      <w:r>
+        <w:t>Filename: RMD-001 Programme Roadmap.docx</w:t>
+      </w:r>
+    </w:p>
+    <w:p>
+      <w:r>
+        <w:br w:type="page"/>
       </w:r>
     </w:p>
     <w:p>
       <w:pPr>
-        <w:pStyle w:val="Heading2"/>
+        <w:pStyle w:val="Heading1"/>
       </w:pPr>
       <w:r>
-        <w:t>RMD-001 Programme Roadmap</w:t>
-      </w:r>
-    </w:p>
-    <w:p>
-      <w:r>
-        <w:t>Top-level roadmap from Foundation Engineering through Alpha, Beta and Production.</w:t>
+        <w:t>Engineering Control Record</w:t>
       </w:r>
     </w:p>
     <w:tbl>
       <w:tblPr>
+        <w:tblStyle w:val="TableGrid"/>
         <w:tblW w:type="auto" w:w="0"/>
         <w:tblLook w:firstColumn="1" w:firstRow="1" w:lastColumn="0" w:lastRow="0" w:noHBand="0" w:noVBand="1" w:val="04A0"/>
       </w:tblPr>
@@ -32,6 +49,72 @@
         <w:gridCol w:w="4320"/>
         <w:gridCol w:w="4320"/>
       </w:tblGrid>
+      <w:tr>
+        <w:tc>
+          <w:tcPr>
+            <w:tcW w:type="dxa" w:w="4320"/>
+          </w:tcPr>
+          <w:p>
+            <w:r>
+              <w:t>Field</w:t>
+            </w:r>
+          </w:p>
+        </w:tc>
+        <w:tc>
+          <w:tcPr>
+            <w:tcW w:type="dxa" w:w="4320"/>
+          </w:tcPr>
+          <w:p>
+            <w:r>
+              <w:t>Value</w:t>
+            </w:r>
+          </w:p>
+        </w:tc>
+      </w:tr>
+      <w:tr>
+        <w:tc>
+          <w:tcPr>
+            <w:tcW w:type="dxa" w:w="4320"/>
+          </w:tcPr>
+          <w:p>
+            <w:r>
+              <w:t>Document ID</w:t>
+            </w:r>
+          </w:p>
+        </w:tc>
+        <w:tc>
+          <w:tcPr>
+            <w:tcW w:type="dxa" w:w="4320"/>
+          </w:tcPr>
+          <w:p>
+            <w:r>
+              <w:t>RMD-001</w:t>
+            </w:r>
+          </w:p>
+        </w:tc>
+      </w:tr>
+      <w:tr>
+        <w:tc>
+          <w:tcPr>
+            <w:tcW w:type="dxa" w:w="4320"/>
+          </w:tcPr>
+          <w:p>
+            <w:r>
+              <w:t>Title</w:t>
+            </w:r>
+          </w:p>
+        </w:tc>
+        <w:tc>
+          <w:tcPr>
+            <w:tcW w:type="dxa" w:w="4320"/>
+          </w:tcPr>
+          <w:p>
+            <w:r>
+              <w:t>Programme Roadmap</w:t>
+            </w:r>
+          </w:p>
+        </w:tc>
+      </w:tr>
       <w:tr>
         <w:tc>
           <w:tcPr>
@@ -50,6 +133,94 @@
           <w:p>
             <w:r>
               <w:t>CONTROLLED</w:t>
+            </w:r>
+          </w:p>
+        </w:tc>
+      </w:tr>
+      <w:tr>
+        <w:tc>
+          <w:tcPr>
+            <w:tcW w:type="dxa" w:w="4320"/>
+          </w:tcPr>
+          <w:p>
+            <w:r>
+              <w:t>Version</w:t>
+            </w:r>
+          </w:p>
+        </w:tc>
+        <w:tc>
+          <w:tcPr>
+            <w:tcW w:type="dxa" w:w="4320"/>
+          </w:tcPr>
+          <w:p>
+            <w:r>
+              <w:t>1.0</w:t>
+            </w:r>
+          </w:p>
+        </w:tc>
+      </w:tr>
+      <w:tr>
+        <w:tc>
+          <w:tcPr>
+            <w:tcW w:type="dxa" w:w="4320"/>
+          </w:tcPr>
+          <w:p>
+            <w:r>
+              <w:t>Owner</w:t>
+            </w:r>
+          </w:p>
+        </w:tc>
+        <w:tc>
+          <w:tcPr>
+            <w:tcW w:type="dxa" w:w="4320"/>
+          </w:tcPr>
+          <w:p>
+            <w:r>
+              <w:t>Programme Office</w:t>
+            </w:r>
+          </w:p>
+        </w:tc>
+      </w:tr>
+      <w:tr>
+        <w:tc>
+          <w:tcPr>
+            <w:tcW w:type="dxa" w:w="4320"/>
+          </w:tcPr>
+          <w:p>
+            <w:r>
+              <w:t>Repository Path</w:t>
+            </w:r>
+          </w:p>
+        </w:tc>
+        <w:tc>
+          <w:tcPr>
+            <w:tcW w:type="dxa" w:w="4320"/>
+          </w:tcPr>
+          <w:p>
+            <w:r>
+              <w:t>tooling\ProgrammeManagement\01 Roadmap\</w:t>
+            </w:r>
+          </w:p>
+        </w:tc>
+      </w:tr>
+      <w:tr>
+        <w:tc>
+          <w:tcPr>
+            <w:tcW w:type="dxa" w:w="4320"/>
+          </w:tcPr>
+          <w:p>
+            <w:r>
+              <w:t>Filename</w:t>
+            </w:r>
+          </w:p>
+        </w:tc>
+        <w:tc>
+          <w:tcPr>
+            <w:tcW w:type="dxa" w:w="4320"/>
+          </w:tcPr>
+          <w:p>
+            <w:r>
+              <w:t>RMD-001 Programme Roadmap.docx</w:t>
             </w:r>
           </w:p>
         </w:tc>
@@ -83,7 +254,304 @@
           </w:tcPr>
           <w:p>
             <w:r>
-              <w:t>Repository Path</w:t>
+              <w:t>Last Updated</w:t>
+            </w:r>
+          </w:p>
+        </w:tc>
+        <w:tc>
+          <w:tcPr>
+            <w:tcW w:type="dxa" w:w="4320"/>
+          </w:tcPr>
+          <w:p>
+            <w:r/>
+          </w:p>
+        </w:tc>
+      </w:tr>
+      <w:tr>
+        <w:tc>
+          <w:tcPr>
+            <w:tcW w:type="dxa" w:w="4320"/>
+          </w:tcPr>
+          <w:p>
+            <w:r>
+              <w:t>Next Review</w:t>
+            </w:r>
+          </w:p>
+        </w:tc>
+        <w:tc>
+          <w:tcPr>
+            <w:tcW w:type="dxa" w:w="4320"/>
+          </w:tcPr>
+          <w:p>
+            <w:r/>
+          </w:p>
+        </w:tc>
+      </w:tr>
+    </w:tbl>
+    <w:p>
+      <w:pPr>
+        <w:pStyle w:val="Heading1"/>
+      </w:pPr>
+      <w:r>
+        <w:t>Revision History</w:t>
+      </w:r>
+    </w:p>
+    <w:tbl>
+      <w:tblPr>
+        <w:tblStyle w:val="TableGrid"/>
+        <w:tblW w:type="auto" w:w="0"/>
+        <w:tblLook w:firstColumn="1" w:firstRow="1" w:lastColumn="0" w:lastRow="0" w:noHBand="0" w:noVBand="1" w:val="04A0"/>
+      </w:tblPr>
+      <w:tblGrid>
+        <w:gridCol w:w="1728"/>
+        <w:gridCol w:w="1728"/>
+        <w:gridCol w:w="1728"/>
+        <w:gridCol w:w="1728"/>
+        <w:gridCol w:w="1728"/>
+      </w:tblGrid>
+      <w:tr>
+        <w:tc>
+          <w:tcPr>
+            <w:tcW w:type="dxa" w:w="1728"/>
+          </w:tcPr>
+          <w:p>
+            <w:r>
+              <w:t>Version</w:t>
+            </w:r>
+          </w:p>
+        </w:tc>
+        <w:tc>
+          <w:tcPr>
+            <w:tcW w:type="dxa" w:w="1728"/>
+          </w:tcPr>
+          <w:p>
+            <w:r>
+              <w:t>Date</w:t>
+            </w:r>
+          </w:p>
+        </w:tc>
+        <w:tc>
+          <w:tcPr>
+            <w:tcW w:type="dxa" w:w="1728"/>
+          </w:tcPr>
+          <w:p>
+            <w:r>
+              <w:t>Author</w:t>
+            </w:r>
+          </w:p>
+        </w:tc>
+        <w:tc>
+          <w:tcPr>
+            <w:tcW w:type="dxa" w:w="1728"/>
+          </w:tcPr>
+          <w:p>
+            <w:r>
+              <w:t>Change</w:t>
+            </w:r>
+          </w:p>
+        </w:tc>
+        <w:tc>
+          <w:tcPr>
+            <w:tcW w:type="dxa" w:w="1728"/>
+          </w:tcPr>
+          <w:p>
+            <w:r>
+              <w:t>Status</w:t>
+            </w:r>
+          </w:p>
+        </w:tc>
+      </w:tr>
+      <w:tr>
+        <w:tc>
+          <w:tcPr>
+            <w:tcW w:type="dxa" w:w="1728"/>
+          </w:tcPr>
+          <w:p>
+            <w:r>
+              <w:t>1.0</w:t>
+            </w:r>
+          </w:p>
+        </w:tc>
+        <w:tc>
+          <w:tcPr>
+            <w:tcW w:type="dxa" w:w="1728"/>
+          </w:tcPr>
+          <w:p>
+            <w:r/>
+          </w:p>
+        </w:tc>
+        <w:tc>
+          <w:tcPr>
+            <w:tcW w:type="dxa" w:w="1728"/>
+          </w:tcPr>
+          <w:p>
+            <w:r>
+              <w:t>Programme Office</w:t>
+            </w:r>
+          </w:p>
+        </w:tc>
+        <w:tc>
+          <w:tcPr>
+            <w:tcW w:type="dxa" w:w="1728"/>
+          </w:tcPr>
+          <w:p>
+            <w:r>
+              <w:t>Initial Issue</w:t>
+            </w:r>
+          </w:p>
+        </w:tc>
+        <w:tc>
+          <w:tcPr>
+            <w:tcW w:type="dxa" w:w="1728"/>
+          </w:tcPr>
+          <w:p>
+            <w:r>
+              <w:t>CONTROLLED</w:t>
+            </w:r>
+          </w:p>
+        </w:tc>
+      </w:tr>
+    </w:tbl>
+    <w:p>
+      <w:pPr>
+        <w:pStyle w:val="Heading1"/>
+      </w:pPr>
+      <w:r>
+        <w:t>Table of Contents</w:t>
+      </w:r>
+    </w:p>
+    <w:p>
+      <w:r>
+        <w:t>1. Cover Page</w:t>
+      </w:r>
+    </w:p>
+    <w:p>
+      <w:r>
+        <w:t>2. Engineering Control Record</w:t>
+      </w:r>
+    </w:p>
+    <w:p>
+      <w:r>
+        <w:t>3. Revision History</w:t>
+      </w:r>
+    </w:p>
+    <w:p>
+      <w:r>
+        <w:t>4. Table of Contents</w:t>
+      </w:r>
+    </w:p>
+    <w:p>
+      <w:r>
+        <w:t>5. Purpose</w:t>
+      </w:r>
+    </w:p>
+    <w:p>
+      <w:r>
+        <w:t>6. Programme Vision</w:t>
+      </w:r>
+    </w:p>
+    <w:p>
+      <w:r>
+        <w:t>7. Current Programme Position</w:t>
+      </w:r>
+    </w:p>
+    <w:p>
+      <w:r>
+        <w:t>8. Programme Phases</w:t>
+      </w:r>
+    </w:p>
+    <w:p>
+      <w:r>
+        <w:t>9. Major Milestones</w:t>
+      </w:r>
+    </w:p>
+    <w:p>
+      <w:r>
+        <w:t>10. Critical Path Overview</w:t>
+      </w:r>
+    </w:p>
+    <w:p>
+      <w:r>
+        <w:t>11. Strategic Workstreams</w:t>
+      </w:r>
+    </w:p>
+    <w:p>
+      <w:r>
+        <w:t>12. Dependencies</w:t>
+      </w:r>
+    </w:p>
+    <w:p>
+      <w:r>
+        <w:t>13. Success Measures</w:t>
+      </w:r>
+    </w:p>
+    <w:p>
+      <w:r>
+        <w:t>14. Roadmap Review</w:t>
+      </w:r>
+    </w:p>
+    <w:p>
+      <w:r>
+        <w:t>15. Related Documents</w:t>
+      </w:r>
+    </w:p>
+    <w:p>
+      <w:r>
+        <w:t>16. Appendices</w:t>
+      </w:r>
+    </w:p>
+    <w:p>
+      <w:pPr>
+        <w:pStyle w:val="Heading1"/>
+      </w:pPr>
+      <w:r>
+        <w:t>Purpose</w:t>
+      </w:r>
+    </w:p>
+    <w:p>
+      <w:r>
+        <w:t>Describe the long-term strategic direction of the JustDefenders programme.</w:t>
+      </w:r>
+    </w:p>
+    <w:p>
+      <w:pPr>
+        <w:pStyle w:val="Heading1"/>
+      </w:pPr>
+      <w:r>
+        <w:t>Programme Vision</w:t>
+      </w:r>
+    </w:p>
+    <w:p>
+      <w:r>
+        <w:t>Build the world's leading intelligence platform for the global Land Rover Defender community, delivering value to owners, clubs, suppliers and commercial partners.</w:t>
+      </w:r>
+    </w:p>
+    <w:p>
+      <w:pPr>
+        <w:pStyle w:val="Heading1"/>
+      </w:pPr>
+      <w:r>
+        <w:t>Current Programme Position</w:t>
+      </w:r>
+    </w:p>
+    <w:tbl>
+      <w:tblPr>
+        <w:tblStyle w:val="TableGrid"/>
+        <w:tblW w:type="auto" w:w="0"/>
+        <w:tblLook w:firstColumn="1" w:firstRow="1" w:lastColumn="0" w:lastRow="0" w:noHBand="0" w:noVBand="1" w:val="04A0"/>
+      </w:tblPr>
+      <w:tblGrid>
+        <w:gridCol w:w="4320"/>
+        <w:gridCol w:w="4320"/>
+      </w:tblGrid>
+      <w:tr>
+        <w:tc>
+          <w:tcPr>
+            <w:tcW w:type="dxa" w:w="4320"/>
+          </w:tcPr>
+          <w:p>
+            <w:r>
+              <w:t>Field</w:t>
             </w:r>
           </w:p>
         </w:tc>
@@ -93,7 +561,7 @@
           </w:tcPr>
           <w:p>
             <w:r>
-              <w:t>tooling\ProgrammeManagement\01 Roadmap\</w:t>
+              <w:t>Value</w:t>
             </w:r>
           </w:p>
         </w:tc>
@@ -105,7 +573,532 @@
           </w:tcPr>
           <w:p>
             <w:r>
-              <w:t>Version</w:t>
+              <w:t>Current Programme Phase</w:t>
+            </w:r>
+          </w:p>
+        </w:tc>
+        <w:tc>
+          <w:tcPr>
+            <w:tcW w:type="dxa" w:w="4320"/>
+          </w:tcPr>
+          <w:p>
+            <w:r/>
+          </w:p>
+        </w:tc>
+      </w:tr>
+      <w:tr>
+        <w:tc>
+          <w:tcPr>
+            <w:tcW w:type="dxa" w:w="4320"/>
+          </w:tcPr>
+          <w:p>
+            <w:r>
+              <w:t>Current Engineering Baseline</w:t>
+            </w:r>
+          </w:p>
+        </w:tc>
+        <w:tc>
+          <w:tcPr>
+            <w:tcW w:type="dxa" w:w="4320"/>
+          </w:tcPr>
+          <w:p>
+            <w:r/>
+          </w:p>
+        </w:tc>
+      </w:tr>
+      <w:tr>
+        <w:tc>
+          <w:tcPr>
+            <w:tcW w:type="dxa" w:w="4320"/>
+          </w:tcPr>
+          <w:p>
+            <w:r>
+              <w:t>Current Branch</w:t>
+            </w:r>
+          </w:p>
+        </w:tc>
+        <w:tc>
+          <w:tcPr>
+            <w:tcW w:type="dxa" w:w="4320"/>
+          </w:tcPr>
+          <w:p>
+            <w:r/>
+          </w:p>
+        </w:tc>
+      </w:tr>
+      <w:tr>
+        <w:tc>
+          <w:tcPr>
+            <w:tcW w:type="dxa" w:w="4320"/>
+          </w:tcPr>
+          <w:p>
+            <w:r>
+              <w:t>Current Work Package</w:t>
+            </w:r>
+          </w:p>
+        </w:tc>
+        <w:tc>
+          <w:tcPr>
+            <w:tcW w:type="dxa" w:w="4320"/>
+          </w:tcPr>
+          <w:p>
+            <w:r/>
+          </w:p>
+        </w:tc>
+      </w:tr>
+      <w:tr>
+        <w:tc>
+          <w:tcPr>
+            <w:tcW w:type="dxa" w:w="4320"/>
+          </w:tcPr>
+          <w:p>
+            <w:r>
+              <w:t>Current Objective</w:t>
+            </w:r>
+          </w:p>
+        </w:tc>
+        <w:tc>
+          <w:tcPr>
+            <w:tcW w:type="dxa" w:w="4320"/>
+          </w:tcPr>
+          <w:p>
+            <w:r/>
+          </w:p>
+        </w:tc>
+      </w:tr>
+    </w:tbl>
+    <w:p>
+      <w:pPr>
+        <w:pStyle w:val="Heading1"/>
+      </w:pPr>
+      <w:r>
+        <w:t>Programme Phases</w:t>
+      </w:r>
+    </w:p>
+    <w:tbl>
+      <w:tblPr>
+        <w:tblStyle w:val="TableGrid"/>
+        <w:tblW w:type="auto" w:w="0"/>
+        <w:tblLook w:firstColumn="1" w:firstRow="1" w:lastColumn="0" w:lastRow="0" w:noHBand="0" w:noVBand="1" w:val="04A0"/>
+      </w:tblPr>
+      <w:tblGrid>
+        <w:gridCol w:w="2160"/>
+        <w:gridCol w:w="2160"/>
+        <w:gridCol w:w="2160"/>
+        <w:gridCol w:w="2160"/>
+      </w:tblGrid>
+      <w:tr>
+        <w:tc>
+          <w:tcPr>
+            <w:tcW w:type="dxa" w:w="2160"/>
+          </w:tcPr>
+          <w:p>
+            <w:r>
+              <w:t>Phase</w:t>
+            </w:r>
+          </w:p>
+        </w:tc>
+        <w:tc>
+          <w:tcPr>
+            <w:tcW w:type="dxa" w:w="2160"/>
+          </w:tcPr>
+          <w:p>
+            <w:r>
+              <w:t>Purpose</w:t>
+            </w:r>
+          </w:p>
+        </w:tc>
+        <w:tc>
+          <w:tcPr>
+            <w:tcW w:type="dxa" w:w="2160"/>
+          </w:tcPr>
+          <w:p>
+            <w:r>
+              <w:t>Primary Deliverables</w:t>
+            </w:r>
+          </w:p>
+        </w:tc>
+        <w:tc>
+          <w:tcPr>
+            <w:tcW w:type="dxa" w:w="2160"/>
+          </w:tcPr>
+          <w:p>
+            <w:r>
+              <w:t>Exit Criteria</w:t>
+            </w:r>
+          </w:p>
+        </w:tc>
+      </w:tr>
+      <w:tr>
+        <w:tc>
+          <w:tcPr>
+            <w:tcW w:type="dxa" w:w="2160"/>
+          </w:tcPr>
+          <w:p>
+            <w:r>
+              <w:t>Foundation Engineering</w:t>
+            </w:r>
+          </w:p>
+        </w:tc>
+        <w:tc>
+          <w:tcPr>
+            <w:tcW w:type="dxa" w:w="2160"/>
+          </w:tcPr>
+          <w:p/>
+        </w:tc>
+        <w:tc>
+          <w:tcPr>
+            <w:tcW w:type="dxa" w:w="2160"/>
+          </w:tcPr>
+          <w:p/>
+        </w:tc>
+        <w:tc>
+          <w:tcPr>
+            <w:tcW w:type="dxa" w:w="2160"/>
+          </w:tcPr>
+          <w:p/>
+        </w:tc>
+      </w:tr>
+      <w:tr>
+        <w:tc>
+          <w:tcPr>
+            <w:tcW w:type="dxa" w:w="2160"/>
+          </w:tcPr>
+          <w:p>
+            <w:r>
+              <w:t>Alpha</w:t>
+            </w:r>
+          </w:p>
+        </w:tc>
+        <w:tc>
+          <w:tcPr>
+            <w:tcW w:type="dxa" w:w="2160"/>
+          </w:tcPr>
+          <w:p/>
+        </w:tc>
+        <w:tc>
+          <w:tcPr>
+            <w:tcW w:type="dxa" w:w="2160"/>
+          </w:tcPr>
+          <w:p/>
+        </w:tc>
+        <w:tc>
+          <w:tcPr>
+            <w:tcW w:type="dxa" w:w="2160"/>
+          </w:tcPr>
+          <w:p/>
+        </w:tc>
+      </w:tr>
+      <w:tr>
+        <w:tc>
+          <w:tcPr>
+            <w:tcW w:type="dxa" w:w="2160"/>
+          </w:tcPr>
+          <w:p>
+            <w:r>
+              <w:t>Beta</w:t>
+            </w:r>
+          </w:p>
+        </w:tc>
+        <w:tc>
+          <w:tcPr>
+            <w:tcW w:type="dxa" w:w="2160"/>
+          </w:tcPr>
+          <w:p/>
+        </w:tc>
+        <w:tc>
+          <w:tcPr>
+            <w:tcW w:type="dxa" w:w="2160"/>
+          </w:tcPr>
+          <w:p/>
+        </w:tc>
+        <w:tc>
+          <w:tcPr>
+            <w:tcW w:type="dxa" w:w="2160"/>
+          </w:tcPr>
+          <w:p/>
+        </w:tc>
+      </w:tr>
+      <w:tr>
+        <w:tc>
+          <w:tcPr>
+            <w:tcW w:type="dxa" w:w="2160"/>
+          </w:tcPr>
+          <w:p>
+            <w:r>
+              <w:t>Production</w:t>
+            </w:r>
+          </w:p>
+        </w:tc>
+        <w:tc>
+          <w:tcPr>
+            <w:tcW w:type="dxa" w:w="2160"/>
+          </w:tcPr>
+          <w:p/>
+        </w:tc>
+        <w:tc>
+          <w:tcPr>
+            <w:tcW w:type="dxa" w:w="2160"/>
+          </w:tcPr>
+          <w:p/>
+        </w:tc>
+        <w:tc>
+          <w:tcPr>
+            <w:tcW w:type="dxa" w:w="2160"/>
+          </w:tcPr>
+          <w:p/>
+        </w:tc>
+      </w:tr>
+      <w:tr>
+        <w:tc>
+          <w:tcPr>
+            <w:tcW w:type="dxa" w:w="2160"/>
+          </w:tcPr>
+          <w:p>
+            <w:r>
+              <w:t>Operational Evolution</w:t>
+            </w:r>
+          </w:p>
+        </w:tc>
+        <w:tc>
+          <w:tcPr>
+            <w:tcW w:type="dxa" w:w="2160"/>
+          </w:tcPr>
+          <w:p/>
+        </w:tc>
+        <w:tc>
+          <w:tcPr>
+            <w:tcW w:type="dxa" w:w="2160"/>
+          </w:tcPr>
+          <w:p/>
+        </w:tc>
+        <w:tc>
+          <w:tcPr>
+            <w:tcW w:type="dxa" w:w="2160"/>
+          </w:tcPr>
+          <w:p/>
+        </w:tc>
+      </w:tr>
+    </w:tbl>
+    <w:p>
+      <w:pPr>
+        <w:pStyle w:val="Heading1"/>
+      </w:pPr>
+      <w:r>
+        <w:t>Major Milestones</w:t>
+      </w:r>
+    </w:p>
+    <w:tbl>
+      <w:tblPr>
+        <w:tblStyle w:val="TableGrid"/>
+        <w:tblW w:type="auto" w:w="0"/>
+        <w:tblLook w:firstColumn="1" w:firstRow="1" w:lastColumn="0" w:lastRow="0" w:noHBand="0" w:noVBand="1" w:val="04A0"/>
+      </w:tblPr>
+      <w:tblGrid>
+        <w:gridCol w:w="2160"/>
+        <w:gridCol w:w="2160"/>
+        <w:gridCol w:w="2160"/>
+        <w:gridCol w:w="2160"/>
+      </w:tblGrid>
+      <w:tr>
+        <w:tc>
+          <w:tcPr>
+            <w:tcW w:type="dxa" w:w="2160"/>
+          </w:tcPr>
+          <w:p>
+            <w:r>
+              <w:t>Milestone</w:t>
+            </w:r>
+          </w:p>
+        </w:tc>
+        <w:tc>
+          <w:tcPr>
+            <w:tcW w:type="dxa" w:w="2160"/>
+          </w:tcPr>
+          <w:p>
+            <w:r>
+              <w:t>Description</w:t>
+            </w:r>
+          </w:p>
+        </w:tc>
+        <w:tc>
+          <w:tcPr>
+            <w:tcW w:type="dxa" w:w="2160"/>
+          </w:tcPr>
+          <w:p>
+            <w:r>
+              <w:t>Target</w:t>
+            </w:r>
+          </w:p>
+        </w:tc>
+        <w:tc>
+          <w:tcPr>
+            <w:tcW w:type="dxa" w:w="2160"/>
+          </w:tcPr>
+          <w:p>
+            <w:r>
+              <w:t>Status</w:t>
+            </w:r>
+          </w:p>
+        </w:tc>
+      </w:tr>
+    </w:tbl>
+    <w:p>
+      <w:pPr>
+        <w:pStyle w:val="Heading1"/>
+      </w:pPr>
+      <w:r>
+        <w:t>Critical Path Overview</w:t>
+      </w:r>
+    </w:p>
+    <w:p>
+      <w:r>
+        <w:t>Major activities progress through Foundation Engineering, Alpha readiness, production validation, release governance and operational maturity.</w:t>
+      </w:r>
+    </w:p>
+    <w:p>
+      <w:pPr>
+        <w:pStyle w:val="Heading1"/>
+      </w:pPr>
+      <w:r>
+        <w:t>Strategic Workstreams</w:t>
+      </w:r>
+    </w:p>
+    <w:p>
+      <w:pPr>
+        <w:pStyle w:val="ListBullet"/>
+      </w:pPr>
+      <w:r>
+        <w:t>Programme Management</w:t>
+      </w:r>
+    </w:p>
+    <w:p>
+      <w:pPr>
+        <w:pStyle w:val="ListBullet"/>
+      </w:pPr>
+      <w:r>
+        <w:t>Foundation Engineering</w:t>
+      </w:r>
+    </w:p>
+    <w:p>
+      <w:pPr>
+        <w:pStyle w:val="ListBullet"/>
+      </w:pPr>
+      <w:r>
+        <w:t>Platform Development</w:t>
+      </w:r>
+    </w:p>
+    <w:p>
+      <w:pPr>
+        <w:pStyle w:val="ListBullet"/>
+      </w:pPr>
+      <w:r>
+        <w:t>Security</w:t>
+      </w:r>
+    </w:p>
+    <w:p>
+      <w:pPr>
+        <w:pStyle w:val="ListBullet"/>
+      </w:pPr>
+      <w:r>
+        <w:t>Infrastructure</w:t>
+      </w:r>
+    </w:p>
+    <w:p>
+      <w:pPr>
+        <w:pStyle w:val="ListBullet"/>
+      </w:pPr>
+      <w:r>
+        <w:t>Operations</w:t>
+      </w:r>
+    </w:p>
+    <w:p>
+      <w:pPr>
+        <w:pStyle w:val="ListBullet"/>
+      </w:pPr>
+      <w:r>
+        <w:t>Disaster Recovery</w:t>
+      </w:r>
+    </w:p>
+    <w:p>
+      <w:pPr>
+        <w:pStyle w:val="ListBullet"/>
+      </w:pPr>
+      <w:r>
+        <w:t>Mobile Platform</w:t>
+      </w:r>
+    </w:p>
+    <w:p>
+      <w:pPr>
+        <w:pStyle w:val="ListBullet"/>
+      </w:pPr>
+      <w:r>
+        <w:t>Supplier Intelligence</w:t>
+      </w:r>
+    </w:p>
+    <w:p>
+      <w:pPr>
+        <w:pStyle w:val="ListBullet"/>
+      </w:pPr>
+      <w:r>
+        <w:t>Knowledge Platform</w:t>
+      </w:r>
+    </w:p>
+    <w:p>
+      <w:pPr>
+        <w:pStyle w:val="ListBullet"/>
+      </w:pPr>
+      <w:r>
+        <w:t>Community Platform</w:t>
+      </w:r>
+    </w:p>
+    <w:p>
+      <w:pPr>
+        <w:pStyle w:val="ListBullet"/>
+      </w:pPr>
+      <w:r>
+        <w:t>Commercial Platform</w:t>
+      </w:r>
+    </w:p>
+    <w:p>
+      <w:pPr>
+        <w:pStyle w:val="Heading1"/>
+      </w:pPr>
+      <w:r>
+        <w:t>Dependencies</w:t>
+      </w:r>
+    </w:p>
+    <w:p>
+      <w:r>
+        <w:t>Programme delivery depends on coordinated engineering governance, approved work packages, controlled baselines, repository management, infrastructure, external services and stakeholder participation.</w:t>
+      </w:r>
+    </w:p>
+    <w:p>
+      <w:pPr>
+        <w:pStyle w:val="Heading1"/>
+      </w:pPr>
+      <w:r>
+        <w:t>Success Measures</w:t>
+      </w:r>
+    </w:p>
+    <w:tbl>
+      <w:tblPr>
+        <w:tblStyle w:val="TableGrid"/>
+        <w:tblW w:type="auto" w:w="0"/>
+        <w:tblLook w:firstColumn="1" w:firstRow="1" w:lastColumn="0" w:lastRow="0" w:noHBand="0" w:noVBand="1" w:val="04A0"/>
+      </w:tblPr>
+      <w:tblGrid>
+        <w:gridCol w:w="4320"/>
+        <w:gridCol w:w="4320"/>
+      </w:tblGrid>
+      <w:tr>
+        <w:tc>
+          <w:tcPr>
+            <w:tcW w:type="dxa" w:w="4320"/>
+          </w:tcPr>
+          <w:p>
+            <w:r>
+              <w:t>Phase</w:t>
             </w:r>
           </w:p>
         </w:tc>
@@ -115,7 +1108,7 @@
           </w:tcPr>
           <w:p>
             <w:r>
-              <w:t>1.0</w:t>
+              <w:t>Success Measure</w:t>
             </w:r>
           </w:p>
         </w:tc>
@@ -127,7 +1120,7 @@
           </w:tcPr>
           <w:p>
             <w:r>
-              <w:t>Date</w:t>
+              <w:t>Foundation Engineering</w:t>
             </w:r>
           </w:p>
         </w:tc>
@@ -137,12 +1130,174 @@
           </w:tcPr>
           <w:p>
             <w:r>
-              <w:t>02 August 2026</w:t>
+              <w:t>Controlled engineering baseline established.</w:t>
+            </w:r>
+          </w:p>
+        </w:tc>
+      </w:tr>
+      <w:tr>
+        <w:tc>
+          <w:tcPr>
+            <w:tcW w:type="dxa" w:w="4320"/>
+          </w:tcPr>
+          <w:p>
+            <w:r>
+              <w:t>Alpha</w:t>
+            </w:r>
+          </w:p>
+        </w:tc>
+        <w:tc>
+          <w:tcPr>
+            <w:tcW w:type="dxa" w:w="4320"/>
+          </w:tcPr>
+          <w:p>
+            <w:r>
+              <w:t>Core capabilities validated.</w:t>
+            </w:r>
+          </w:p>
+        </w:tc>
+      </w:tr>
+      <w:tr>
+        <w:tc>
+          <w:tcPr>
+            <w:tcW w:type="dxa" w:w="4320"/>
+          </w:tcPr>
+          <w:p>
+            <w:r>
+              <w:t>Beta</w:t>
+            </w:r>
+          </w:p>
+        </w:tc>
+        <w:tc>
+          <w:tcPr>
+            <w:tcW w:type="dxa" w:w="4320"/>
+          </w:tcPr>
+          <w:p>
+            <w:r>
+              <w:t>Validated with representative users.</w:t>
+            </w:r>
+          </w:p>
+        </w:tc>
+      </w:tr>
+      <w:tr>
+        <w:tc>
+          <w:tcPr>
+            <w:tcW w:type="dxa" w:w="4320"/>
+          </w:tcPr>
+          <w:p>
+            <w:r>
+              <w:t>Production</w:t>
+            </w:r>
+          </w:p>
+        </w:tc>
+        <w:tc>
+          <w:tcPr>
+            <w:tcW w:type="dxa" w:w="4320"/>
+          </w:tcPr>
+          <w:p>
+            <w:r>
+              <w:t>Operational production readiness achieved.</w:t>
+            </w:r>
+          </w:p>
+        </w:tc>
+      </w:tr>
+      <w:tr>
+        <w:tc>
+          <w:tcPr>
+            <w:tcW w:type="dxa" w:w="4320"/>
+          </w:tcPr>
+          <w:p>
+            <w:r>
+              <w:t>Operational Evolution</w:t>
+            </w:r>
+          </w:p>
+        </w:tc>
+        <w:tc>
+          <w:tcPr>
+            <w:tcW w:type="dxa" w:w="4320"/>
+          </w:tcPr>
+          <w:p>
+            <w:r>
+              <w:t>Continuous controlled improvement maintained.</w:t>
             </w:r>
           </w:p>
         </w:tc>
       </w:tr>
     </w:tbl>
+    <w:p>
+      <w:pPr>
+        <w:pStyle w:val="Heading1"/>
+      </w:pPr>
+      <w:r>
+        <w:t>Roadmap Review</w:t>
+      </w:r>
+    </w:p>
+    <w:p>
+      <w:r>
+        <w:t>The roadmap is reviewed regularly by the Programme Office and updated through controlled engineering change.</w:t>
+      </w:r>
+    </w:p>
+    <w:p>
+      <w:pPr>
+        <w:pStyle w:val="Heading1"/>
+      </w:pPr>
+      <w:r>
+        <w:t>Related Documents</w:t>
+      </w:r>
+    </w:p>
+    <w:p>
+      <w:pPr>
+        <w:pStyle w:val="ListBullet"/>
+      </w:pPr>
+      <w:r>
+        <w:t>Engineering Policies</w:t>
+      </w:r>
+    </w:p>
+    <w:p>
+      <w:pPr>
+        <w:pStyle w:val="ListBullet"/>
+      </w:pPr>
+      <w:r>
+        <w:t>Programme Charter</w:t>
+      </w:r>
+    </w:p>
+    <w:p>
+      <w:pPr>
+        <w:pStyle w:val="ListBullet"/>
+      </w:pPr>
+      <w:r>
+        <w:t>Programme History</w:t>
+      </w:r>
+    </w:p>
+    <w:p>
+      <w:pPr>
+        <w:pStyle w:val="ListBullet"/>
+      </w:pPr>
+      <w:r>
+        <w:t>Programme Control Book</w:t>
+      </w:r>
+    </w:p>
+    <w:p>
+      <w:pPr>
+        <w:pStyle w:val="ListBullet"/>
+      </w:pPr>
+      <w:r>
+        <w:t>Engineering Configuration Management Database</w:t>
+      </w:r>
+    </w:p>
+    <w:p>
+      <w:pPr>
+        <w:pStyle w:val="Heading1"/>
+      </w:pPr>
+      <w:r>
+        <w:t>Appendices</w:t>
+      </w:r>
+    </w:p>
+    <w:p>
+      <w:r>
+        <w:t>None.</w:t>
+      </w:r>
+    </w:p>
     <w:sectPr>
       <w:pgSz w:w="12240" w:h="15840"/>
       <w:pgMar w:top="1440" w:right="1800" w:bottom="1440" w:left="1800" w:header="720" w:footer="720" w:gutter="0"/>

</xml_diff>